<commit_message>
chore: update CV document for improved content
</commit_message>
<xml_diff>
--- a/src/assets/vinicius_costa_cv_en.docx
+++ b/src/assets/vinicius_costa_cv_en.docx
@@ -4,29 +4,13 @@
   <w:body>
     <w:p>
       <w:pPr>
-        <w:pStyle w:val="Title"/>
-        <w:pageBreakBefore w:val="0"/>
-        <w:pBdr>
-          <w:top w:space="0" w:sz="0" w:val="nil"/>
-          <w:left w:space="0" w:sz="0" w:val="nil"/>
-          <w:bottom w:space="0" w:sz="0" w:val="nil"/>
-          <w:right w:space="0" w:sz="0" w:val="nil"/>
-          <w:between w:space="0" w:sz="0" w:val="nil"/>
-        </w:pBdr>
-        <w:shd w:fill="auto" w:val="clear"/>
-        <w:rPr>
-          <w:b w:val="1"/>
-          <w:bCs w:val="1"/>
-          <w:color w:val="c18c5d"/>
-        </w:rPr>
+        <w:pStyle w:val="Heading1"/>
+        <w:rPr/>
       </w:pPr>
       <w:bookmarkStart w:colFirst="0" w:colLast="0" w:name="_5x0d5h95i329" w:id="0"/>
       <w:bookmarkEnd w:id="0"/>
       <w:r>
         <w:rPr>
-          <w:b w:val="1"/>
-          <w:bCs w:val="1"/>
-          <w:color w:val="c18c5d"/>
           <w:rtl w:val="0"/>
         </w:rPr>
         <w:t xml:space="preserve">VINÍCIUS COSTA</w:t>
@@ -57,12 +41,7 @@
           <w:color w:val="666666"/>
           <w:rtl w:val="0"/>
         </w:rPr>
-        <w:t xml:space="preserve">Front-end Developer</w:t>
-      </w:r>
-      <w:r>
-        <w:rPr>
-          <w:rtl w:val="0"/>
-        </w:rPr>
+        <w:t xml:space="preserve">Front-end developer</w:t>
       </w:r>
     </w:p>
     <w:p>
@@ -79,6 +58,7 @@
           <w:between w:space="0" w:sz="0" w:val="nil"/>
         </w:pBdr>
         <w:shd w:fill="auto" w:val="clear"/>
+        <w:spacing w:after="0" w:before="0" w:line="276" w:lineRule="auto"/>
         <w:ind w:left="0" w:firstLine="0"/>
         <w:jc w:val="left"/>
         <w:rPr>
@@ -94,16 +74,6 @@
           <v:rect style="width:0.0pt;height:1.5pt" o:hr="t" o:hrstd="t" o:hralign="center" fillcolor="#A0A0A0" stroked="f"/>
         </w:pict>
       </w:r>
-      <w:r>
-        <w:rPr>
-          <w:rtl w:val="0"/>
-        </w:rPr>
-      </w:r>
-    </w:p>
-    <w:p>
-      <w:pPr>
-        <w:rPr/>
-      </w:pPr>
       <w:r>
         <w:rPr>
           <w:rtl w:val="0"/>
@@ -121,7 +91,7 @@
           <w:between w:space="0" w:sz="0" w:val="nil"/>
         </w:pBdr>
         <w:shd w:fill="auto" w:val="clear"/>
-        <w:spacing w:before="0" w:line="276" w:lineRule="auto"/>
+        <w:spacing w:after="0" w:before="0" w:line="276" w:lineRule="auto"/>
         <w:rPr>
           <w:rFonts w:ascii="Proxima Nova" w:cs="Proxima Nova" w:eastAsia="Proxima Nova" w:hAnsi="Proxima Nova"/>
           <w:color w:val="666666"/>
@@ -136,7 +106,7 @@
           <w:szCs w:val="24"/>
           <w:rtl w:val="0"/>
         </w:rPr>
-        <w:t xml:space="preserve">Rio Grande - RS  | </w:t>
+        <w:t xml:space="preserve">Rio Grande - RS, Brasil  | </w:t>
       </w:r>
       <w:r>
         <w:rPr>
@@ -176,7 +146,7 @@
           <w:between w:space="0" w:sz="0" w:val="nil"/>
         </w:pBdr>
         <w:shd w:fill="auto" w:val="clear"/>
-        <w:spacing w:before="0" w:line="276" w:lineRule="auto"/>
+        <w:spacing w:after="0" w:before="0" w:line="276" w:lineRule="auto"/>
         <w:rPr>
           <w:sz w:val="24"/>
           <w:szCs w:val="24"/>
@@ -288,7 +258,7 @@
           <w:between w:space="0" w:sz="0" w:val="nil"/>
         </w:pBdr>
         <w:shd w:fill="auto" w:val="clear"/>
-        <w:spacing w:before="0" w:line="240" w:lineRule="auto"/>
+        <w:spacing w:after="0" w:before="0" w:line="276" w:lineRule="auto"/>
         <w:rPr>
           <w:color w:val="666666"/>
           <w:sz w:val="24"/>
@@ -308,30 +278,14 @@
     </w:p>
     <w:p>
       <w:pPr>
-        <w:pStyle w:val="Heading1"/>
-        <w:pageBreakBefore w:val="0"/>
-        <w:pBdr>
-          <w:top w:space="0" w:sz="0" w:val="nil"/>
-          <w:left w:space="0" w:sz="0" w:val="nil"/>
-          <w:bottom w:space="0" w:sz="0" w:val="nil"/>
-          <w:right w:space="0" w:sz="0" w:val="nil"/>
-          <w:between w:space="0" w:sz="0" w:val="nil"/>
-        </w:pBdr>
-        <w:shd w:fill="auto" w:val="clear"/>
+        <w:pStyle w:val="Heading2"/>
         <w:spacing w:before="200" w:lineRule="auto"/>
-        <w:rPr>
-          <w:color w:val="c18c5d"/>
-          <w:sz w:val="30"/>
-          <w:szCs w:val="30"/>
-        </w:rPr>
+        <w:rPr/>
       </w:pPr>
       <w:bookmarkStart w:colFirst="0" w:colLast="0" w:name="_inx73jfg7qti" w:id="3"/>
       <w:bookmarkEnd w:id="3"/>
       <w:r>
         <w:rPr>
-          <w:color w:val="c18c5d"/>
-          <w:sz w:val="30"/>
-          <w:szCs w:val="30"/>
           <w:rtl w:val="0"/>
         </w:rPr>
         <w:t xml:space="preserve">SUMMARY</w:t>
@@ -344,7 +298,7 @@
     </w:p>
     <w:p>
       <w:pPr>
-        <w:spacing w:after="240" w:before="240" w:lineRule="auto"/>
+        <w:spacing w:after="0" w:before="240" w:line="276" w:lineRule="auto"/>
         <w:jc w:val="both"/>
         <w:rPr/>
       </w:pPr>
@@ -380,79 +334,38 @@
     </w:p>
     <w:p>
       <w:pPr>
-        <w:pStyle w:val="Heading1"/>
-        <w:keepNext w:val="0"/>
-        <w:keepLines w:val="0"/>
-        <w:pageBreakBefore w:val="0"/>
-        <w:pBdr>
-          <w:top w:space="0" w:sz="0" w:val="nil"/>
-          <w:left w:space="0" w:sz="0" w:val="nil"/>
-          <w:bottom w:space="0" w:sz="0" w:val="nil"/>
-          <w:right w:space="0" w:sz="0" w:val="nil"/>
-          <w:between w:space="0" w:sz="0" w:val="nil"/>
-        </w:pBdr>
-        <w:shd w:fill="auto" w:val="clear"/>
-        <w:spacing w:after="200" w:before="200" w:line="240" w:lineRule="auto"/>
-        <w:rPr>
-          <w:rFonts w:ascii="Proxima Nova" w:cs="Proxima Nova" w:eastAsia="Proxima Nova" w:hAnsi="Proxima Nova"/>
-          <w:b w:val="1"/>
-          <w:bCs w:val="1"/>
-          <w:color w:val="c18c5d"/>
-          <w:sz w:val="30"/>
-          <w:szCs w:val="30"/>
-        </w:rPr>
-      </w:pPr>
-      <w:bookmarkStart w:colFirst="0" w:colLast="0" w:name="_d0a6vx6wr992" w:id="4"/>
-      <w:bookmarkEnd w:id="4"/>
-      <w:r>
-        <w:rPr>
-          <w:color w:val="c18c5d"/>
-          <w:sz w:val="30"/>
-          <w:szCs w:val="30"/>
-          <w:rtl w:val="0"/>
-        </w:rPr>
-        <w:t xml:space="preserve">PROFESSIONAL EXPERIENCE</w:t>
-      </w:r>
-      <w:r>
-        <w:rPr>
-          <w:rtl w:val="0"/>
-        </w:rPr>
-      </w:r>
-    </w:p>
-    <w:p>
-      <w:pPr>
         <w:pStyle w:val="Heading2"/>
         <w:keepNext w:val="0"/>
         <w:keepLines w:val="0"/>
-        <w:pageBreakBefore w:val="0"/>
-        <w:pBdr>
-          <w:top w:space="0" w:sz="0" w:val="nil"/>
-          <w:left w:space="0" w:sz="0" w:val="nil"/>
-          <w:bottom w:space="0" w:sz="0" w:val="nil"/>
-          <w:right w:space="0" w:sz="0" w:val="nil"/>
-          <w:between w:space="0" w:sz="0" w:val="nil"/>
-        </w:pBdr>
-        <w:shd w:fill="auto" w:val="clear"/>
-        <w:spacing w:line="240" w:lineRule="auto"/>
-        <w:rPr>
-          <w:color w:val="666666"/>
-          <w:sz w:val="20"/>
-          <w:szCs w:val="20"/>
-        </w:rPr>
+        <w:spacing w:before="200" w:lineRule="auto"/>
+        <w:rPr/>
+      </w:pPr>
+      <w:bookmarkStart w:colFirst="0" w:colLast="0" w:name="_d0a6vx6wr992" w:id="4"/>
+      <w:bookmarkEnd w:id="4"/>
+      <w:r>
+        <w:rPr>
+          <w:rtl w:val="0"/>
+        </w:rPr>
+        <w:t xml:space="preserve">PROFESSIONAL EXPERIENCE</w:t>
+      </w:r>
+      <w:r>
+        <w:rPr>
+          <w:rtl w:val="0"/>
+        </w:rPr>
+      </w:r>
+    </w:p>
+    <w:p>
+      <w:pPr>
+        <w:pStyle w:val="Heading3"/>
+        <w:rPr/>
       </w:pPr>
       <w:bookmarkStart w:colFirst="0" w:colLast="0" w:name="_mu43qcboozqe" w:id="5"/>
       <w:bookmarkEnd w:id="5"/>
       <w:r>
         <w:rPr>
-          <w:color w:val="000000"/>
-          <w:rtl w:val="0"/>
-        </w:rPr>
-        <w:t xml:space="preserve">Sympla</w:t>
-      </w:r>
-      <w:r>
-        <w:rPr>
-          <w:rtl w:val="0"/>
-        </w:rPr>
+          <w:rtl w:val="0"/>
+        </w:rPr>
+        <w:t xml:space="preserve">Mid Front-end Developer</w:t>
       </w:r>
     </w:p>
     <w:tbl>
@@ -476,7 +389,236 @@
       <w:tr>
         <w:trPr>
           <w:cantSplit w:val="1"/>
-          <w:trHeight w:val="566.9291338582677" w:hRule="atLeast"/>
+          <w:tblHeader w:val="0"/>
+        </w:trPr>
+        <w:tc>
+          <w:tcPr>
+            <w:shd w:fill="auto" w:val="clear"/>
+            <w:tcMar>
+              <w:top w:w="0.0" w:type="dxa"/>
+              <w:left w:w="0.0" w:type="dxa"/>
+              <w:bottom w:w="0.0" w:type="dxa"/>
+              <w:right w:w="0.0" w:type="dxa"/>
+            </w:tcMar>
+            <w:vAlign w:val="center"/>
+          </w:tcPr>
+          <w:p>
+            <w:pPr>
+              <w:spacing w:before="0" w:line="240" w:lineRule="auto"/>
+              <w:rPr>
+                <w:color w:val="666666"/>
+              </w:rPr>
+            </w:pPr>
+            <w:r>
+              <w:rPr>
+                <w:color w:val="666666"/>
+                <w:rtl w:val="0"/>
+              </w:rPr>
+              <w:t xml:space="preserve">Sympla</w:t>
+            </w:r>
+          </w:p>
+        </w:tc>
+        <w:tc>
+          <w:tcPr>
+            <w:shd w:fill="auto" w:val="clear"/>
+            <w:tcMar>
+              <w:top w:w="0.0" w:type="dxa"/>
+              <w:left w:w="0.0" w:type="dxa"/>
+              <w:bottom w:w="0.0" w:type="dxa"/>
+              <w:right w:w="0.0" w:type="dxa"/>
+            </w:tcMar>
+            <w:vAlign w:val="center"/>
+          </w:tcPr>
+          <w:p>
+            <w:pPr>
+              <w:pStyle w:val="Heading4"/>
+              <w:spacing w:before="0" w:line="240" w:lineRule="auto"/>
+              <w:jc w:val="right"/>
+              <w:rPr/>
+            </w:pPr>
+            <w:bookmarkStart w:colFirst="0" w:colLast="0" w:name="_jyssthgjxgm1" w:id="6"/>
+            <w:bookmarkEnd w:id="6"/>
+            <w:r>
+              <w:rPr>
+                <w:rtl w:val="0"/>
+              </w:rPr>
+              <w:t xml:space="preserve">NOV 2025 — JUN 2026</w:t>
+            </w:r>
+          </w:p>
+        </w:tc>
+      </w:tr>
+    </w:tbl>
+    <w:p>
+      <w:pPr>
+        <w:numPr>
+          <w:ilvl w:val="0"/>
+          <w:numId w:val="1"/>
+        </w:numPr>
+        <w:spacing w:after="0" w:afterAutospacing="0" w:before="200" w:line="240" w:lineRule="auto"/>
+        <w:ind w:left="720" w:hanging="360"/>
+        <w:jc w:val="both"/>
+      </w:pPr>
+      <w:r>
+        <w:rPr>
+          <w:rtl w:val="0"/>
+        </w:rPr>
+        <w:t xml:space="preserve">Led the development and maintenance of the ticketing platform using React, Next.js and TypeScript, optimizing performance and user experience throughout the purchase journey.</w:t>
+      </w:r>
+    </w:p>
+    <w:p>
+      <w:pPr>
+        <w:numPr>
+          <w:ilvl w:val="0"/>
+          <w:numId w:val="1"/>
+        </w:numPr>
+        <w:spacing w:after="0" w:afterAutospacing="0" w:before="0" w:beforeAutospacing="0" w:line="240" w:lineRule="auto"/>
+        <w:ind w:left="720" w:hanging="360"/>
+        <w:jc w:val="both"/>
+      </w:pPr>
+      <w:r>
+        <w:rPr>
+          <w:rtl w:val="0"/>
+        </w:rPr>
+        <w:t xml:space="preserve">Structured analytics tracking via Mixpanel across 5 applications, mapping 100+ events for behavior analysis, which drove platform usage by 400%.</w:t>
+      </w:r>
+    </w:p>
+    <w:p>
+      <w:pPr>
+        <w:numPr>
+          <w:ilvl w:val="0"/>
+          <w:numId w:val="1"/>
+        </w:numPr>
+        <w:spacing w:after="0" w:afterAutospacing="0" w:before="0" w:beforeAutospacing="0" w:line="240" w:lineRule="auto"/>
+        <w:ind w:left="720" w:hanging="360"/>
+        <w:jc w:val="both"/>
+      </w:pPr>
+      <w:r>
+        <w:rPr>
+          <w:rtl w:val="0"/>
+        </w:rPr>
+        <w:t xml:space="preserve">Managed the architectural migration from AWS Redshift to AWS Athena, reducing infrastructure costs through reconciliation scripts and rollout control via feature flags.</w:t>
+      </w:r>
+    </w:p>
+    <w:p>
+      <w:pPr>
+        <w:numPr>
+          <w:ilvl w:val="0"/>
+          <w:numId w:val="1"/>
+        </w:numPr>
+        <w:spacing w:after="0" w:afterAutospacing="0" w:before="0" w:beforeAutospacing="0" w:line="240" w:lineRule="auto"/>
+        <w:ind w:left="720" w:hanging="360"/>
+        <w:jc w:val="both"/>
+      </w:pPr>
+      <w:r>
+        <w:rPr>
+          <w:rtl w:val="0"/>
+        </w:rPr>
+        <w:t xml:space="preserve">Developed a custom push notifications system with Braze SDK and Service Workers, ensuring high reliability through unit tests with Jest.</w:t>
+      </w:r>
+    </w:p>
+    <w:p>
+      <w:pPr>
+        <w:numPr>
+          <w:ilvl w:val="0"/>
+          <w:numId w:val="1"/>
+        </w:numPr>
+        <w:spacing w:before="0" w:beforeAutospacing="0" w:line="240" w:lineRule="auto"/>
+        <w:ind w:left="720" w:hanging="360"/>
+        <w:jc w:val="both"/>
+      </w:pPr>
+      <w:r>
+        <w:rPr>
+          <w:rtl w:val="0"/>
+        </w:rPr>
+        <w:t xml:space="preserve">Standardized the private npm package publishing workflow on GitLab Registry, promoting efficient library reuse and accelerating cross-team development.</w:t>
+      </w:r>
+      <w:r>
+        <w:rPr>
+          <w:rtl w:val="0"/>
+        </w:rPr>
+      </w:r>
+    </w:p>
+    <w:p>
+      <w:pPr>
+        <w:pageBreakBefore w:val="0"/>
+        <w:pBdr>
+          <w:top w:space="0" w:sz="0" w:val="nil"/>
+          <w:left w:space="0" w:sz="0" w:val="nil"/>
+          <w:bottom w:space="0" w:sz="0" w:val="nil"/>
+          <w:right w:space="0" w:sz="0" w:val="nil"/>
+          <w:between w:space="0" w:sz="0" w:val="nil"/>
+        </w:pBdr>
+        <w:shd w:fill="auto" w:val="clear"/>
+        <w:spacing w:before="200" w:line="240" w:lineRule="auto"/>
+        <w:ind w:left="0" w:firstLine="0"/>
+        <w:jc w:val="both"/>
+        <w:rPr/>
+      </w:pPr>
+      <w:r>
+        <w:rPr>
+          <w:b w:val="1"/>
+          <w:bCs w:val="1"/>
+          <w:rtl w:val="0"/>
+        </w:rPr>
+        <w:t xml:space="preserve">Tech Stack</w:t>
+      </w:r>
+      <w:r>
+        <w:rPr>
+          <w:rtl w:val="0"/>
+        </w:rPr>
+        <w:t xml:space="preserve">: React, Next.js, TypeScript, Mixpanel, AWS Redshift, AWS Athena, Braze SDK, Service Workers, Jest, npm, GitLab Registry, Markdown, IA (Copilot, Claude).</w:t>
+      </w:r>
+      <w:r>
+        <w:br w:type="page"/>
+      </w:r>
+      <w:r>
+        <w:rPr>
+          <w:rtl w:val="0"/>
+        </w:rPr>
+      </w:r>
+    </w:p>
+    <w:p>
+      <w:pPr>
+        <w:pStyle w:val="Heading3"/>
+        <w:keepNext w:val="0"/>
+        <w:keepLines w:val="0"/>
+        <w:rPr/>
+      </w:pPr>
+      <w:bookmarkStart w:colFirst="0" w:colLast="0" w:name="_em3nacji519j" w:id="7"/>
+      <w:bookmarkEnd w:id="7"/>
+      <w:r>
+        <w:rPr>
+          <w:rtl w:val="0"/>
+        </w:rPr>
+        <w:t xml:space="preserve">Junior Front-end Developer</w:t>
+      </w:r>
+      <w:r>
+        <w:rPr>
+          <w:rtl w:val="0"/>
+        </w:rPr>
+      </w:r>
+    </w:p>
+    <w:tbl>
+      <w:tblPr>
+        <w:tblStyle w:val="Table2"/>
+        <w:tblW w:w="9480.0" w:type="dxa"/>
+        <w:jc w:val="left"/>
+        <w:tblLayout w:type="fixed"/>
+        <w:tblLook w:val="0600"/>
+      </w:tblPr>
+      <w:tblGrid>
+        <w:gridCol w:w="4740"/>
+        <w:gridCol w:w="4740"/>
+        <w:tblGridChange w:id="0">
+          <w:tblGrid>
+            <w:gridCol w:w="4740"/>
+            <w:gridCol w:w="4740"/>
+          </w:tblGrid>
+        </w:tblGridChange>
+      </w:tblGrid>
+      <w:tr>
+        <w:trPr>
+          <w:cantSplit w:val="1"/>
           <w:tblHeader w:val="0"/>
         </w:trPr>
         <w:tc>
@@ -502,7 +644,7 @@
                 <w:color w:val="666666"/>
                 <w:rtl w:val="0"/>
               </w:rPr>
-              <w:t xml:space="preserve">Front-end developer</w:t>
+              <w:t xml:space="preserve">InfoPrice</w:t>
             </w:r>
           </w:p>
         </w:tc>
@@ -519,22 +661,18 @@
           </w:tcPr>
           <w:p>
             <w:pPr>
+              <w:pStyle w:val="Heading4"/>
               <w:spacing w:line="240" w:lineRule="auto"/>
               <w:jc w:val="right"/>
-              <w:rPr>
-                <w:color w:val="666666"/>
-                <w:sz w:val="20"/>
-                <w:szCs w:val="20"/>
-              </w:rPr>
+              <w:rPr/>
             </w:pPr>
+            <w:bookmarkStart w:colFirst="0" w:colLast="0" w:name="_lkw3vf1ak88c" w:id="8"/>
+            <w:bookmarkEnd w:id="8"/>
             <w:r>
               <w:rPr>
-                <w:color w:val="666666"/>
-                <w:sz w:val="20"/>
-                <w:szCs w:val="20"/>
                 <w:rtl w:val="0"/>
               </w:rPr>
-              <w:t xml:space="preserve">NOVEMBER 2025 — JUNE 2026</w:t>
+              <w:t xml:space="preserve">JUN 2023 — OCT 2025</w:t>
             </w:r>
           </w:p>
         </w:tc>
@@ -542,236 +680,108 @@
     </w:tbl>
     <w:p>
       <w:pPr>
-        <w:pageBreakBefore w:val="0"/>
         <w:numPr>
           <w:ilvl w:val="0"/>
           <w:numId w:val="1"/>
         </w:numPr>
-        <w:pBdr>
-          <w:top w:space="0" w:sz="0" w:val="nil"/>
-          <w:left w:space="0" w:sz="0" w:val="nil"/>
-          <w:bottom w:space="0" w:sz="0" w:val="nil"/>
-          <w:right w:space="0" w:sz="0" w:val="nil"/>
-          <w:between w:space="0" w:sz="0" w:val="nil"/>
-        </w:pBdr>
-        <w:shd w:fill="auto" w:val="clear"/>
-        <w:spacing w:after="0" w:afterAutospacing="0" w:before="80" w:line="240" w:lineRule="auto"/>
+        <w:spacing w:after="0" w:afterAutospacing="0" w:before="200" w:line="240" w:lineRule="auto"/>
         <w:ind w:left="720" w:hanging="360"/>
         <w:jc w:val="both"/>
-        <w:rPr>
-          <w:highlight w:val="white"/>
-          <w:u w:val="none"/>
-        </w:rPr>
-      </w:pPr>
-      <w:r>
-        <w:rPr>
-          <w:rtl w:val="0"/>
-        </w:rPr>
-        <w:t xml:space="preserve">Developed and maintained applications for a ticketing platform using React, Next.js, and TypeScript, focusing on performance, type safety, and the buyer journey experience.</w:t>
-      </w:r>
-      <w:r>
-        <w:rPr>
-          <w:rtl w:val="0"/>
-        </w:rPr>
-      </w:r>
-    </w:p>
-    <w:p>
-      <w:pPr>
-        <w:pageBreakBefore w:val="0"/>
+      </w:pPr>
+      <w:r>
+        <w:rPr>
+          <w:rtl w:val="0"/>
+        </w:rPr>
+        <w:t xml:space="preserve">Led the front-end evolution of a B2B SaaS pricing platform for 27,000 stores, using React, TypeScript and Redux to ensure scalability and performance.</w:t>
+      </w:r>
+    </w:p>
+    <w:p>
+      <w:pPr>
         <w:numPr>
           <w:ilvl w:val="0"/>
           <w:numId w:val="1"/>
         </w:numPr>
-        <w:pBdr>
-          <w:top w:space="0" w:sz="0" w:val="nil"/>
-          <w:left w:space="0" w:sz="0" w:val="nil"/>
-          <w:bottom w:space="0" w:sz="0" w:val="nil"/>
-          <w:right w:space="0" w:sz="0" w:val="nil"/>
-          <w:between w:space="0" w:sz="0" w:val="nil"/>
-        </w:pBdr>
-        <w:shd w:fill="auto" w:val="clear"/>
         <w:spacing w:after="0" w:afterAutospacing="0" w:before="0" w:beforeAutospacing="0" w:line="240" w:lineRule="auto"/>
         <w:ind w:left="720" w:hanging="360"/>
         <w:jc w:val="both"/>
-        <w:rPr>
-          <w:u w:val="none"/>
-        </w:rPr>
-      </w:pPr>
-      <w:r>
-        <w:rPr>
-          <w:rtl w:val="0"/>
-        </w:rPr>
-        <w:t xml:space="preserve">Implemented analytics tracking with Mixpanel across 5 applications, structuring 100+ events to analyze user behavior and monitor the buyer journey, contributing to a 400% increase in platform usage.</w:t>
-      </w:r>
-    </w:p>
-    <w:p>
-      <w:pPr>
-        <w:pageBreakBefore w:val="0"/>
+      </w:pPr>
+      <w:r>
+        <w:rPr>
+          <w:rtl w:val="0"/>
+        </w:rPr>
+        <w:t xml:space="preserve">Optimized the development cycle by 30% by standardizing components in the Design System with SASS and LESS, ensuring visual consistency and high code reuse.</w:t>
+      </w:r>
+    </w:p>
+    <w:p>
+      <w:pPr>
         <w:numPr>
           <w:ilvl w:val="0"/>
           <w:numId w:val="1"/>
         </w:numPr>
-        <w:pBdr>
-          <w:top w:space="0" w:sz="0" w:val="nil"/>
-          <w:left w:space="0" w:sz="0" w:val="nil"/>
-          <w:bottom w:space="0" w:sz="0" w:val="nil"/>
-          <w:right w:space="0" w:sz="0" w:val="nil"/>
-          <w:between w:space="0" w:sz="0" w:val="nil"/>
-        </w:pBdr>
-        <w:shd w:fill="auto" w:val="clear"/>
         <w:spacing w:after="0" w:afterAutospacing="0" w:before="0" w:beforeAutospacing="0" w:line="240" w:lineRule="auto"/>
         <w:ind w:left="720" w:hanging="360"/>
         <w:jc w:val="both"/>
-        <w:rPr>
-          <w:u w:val="none"/>
-        </w:rPr>
-      </w:pPr>
-      <w:r>
-        <w:rPr>
-          <w:rtl w:val="0"/>
-        </w:rPr>
-        <w:t xml:space="preserve">Led the architectural migration of the analytics database from AWS Redshift to AWS Athena, developing data reconciliation scripts and managing the rollout through feature flags, significantly reducing infrastructure costs.</w:t>
-      </w:r>
-    </w:p>
-    <w:p>
-      <w:pPr>
-        <w:pageBreakBefore w:val="0"/>
+      </w:pPr>
+      <w:r>
+        <w:rPr>
+          <w:rtl w:val="0"/>
+        </w:rPr>
+        <w:t xml:space="preserve">Mitigated 40% of production bugs by implementing automated tests with Jest and React Testing Library, reaching 80% coverage on critical business flows.</w:t>
+      </w:r>
+    </w:p>
+    <w:p>
+      <w:pPr>
         <w:numPr>
           <w:ilvl w:val="0"/>
           <w:numId w:val="1"/>
         </w:numPr>
-        <w:pBdr>
-          <w:top w:space="0" w:sz="0" w:val="nil"/>
-          <w:left w:space="0" w:sz="0" w:val="nil"/>
-          <w:bottom w:space="0" w:sz="0" w:val="nil"/>
-          <w:right w:space="0" w:sz="0" w:val="nil"/>
-          <w:between w:space="0" w:sz="0" w:val="nil"/>
-        </w:pBdr>
-        <w:shd w:fill="auto" w:val="clear"/>
-        <w:spacing w:after="0" w:afterAutospacing="0" w:before="0" w:beforeAutospacing="0" w:line="240" w:lineRule="auto"/>
-        <w:ind w:left="720" w:hanging="360"/>
-        <w:jc w:val="both"/>
-        <w:rPr>
-          <w:u w:val="none"/>
-        </w:rPr>
-      </w:pPr>
-      <w:r>
-        <w:rPr>
-          <w:rtl w:val="0"/>
-        </w:rPr>
-        <w:t xml:space="preserve">Developed a custom push notification system integrating the Braze SDK with Service Workers, handling background and foreground logic with reliability supported by Jest unit tests.</w:t>
-      </w:r>
-    </w:p>
-    <w:p>
-      <w:pPr>
-        <w:pageBreakBefore w:val="0"/>
-        <w:numPr>
-          <w:ilvl w:val="0"/>
-          <w:numId w:val="1"/>
-        </w:numPr>
-        <w:pBdr>
-          <w:top w:space="0" w:sz="0" w:val="nil"/>
-          <w:left w:space="0" w:sz="0" w:val="nil"/>
-          <w:bottom w:space="0" w:sz="0" w:val="nil"/>
-          <w:right w:space="0" w:sz="0" w:val="nil"/>
-          <w:between w:space="0" w:sz="0" w:val="nil"/>
-        </w:pBdr>
-        <w:shd w:fill="auto" w:val="clear"/>
-        <w:spacing w:after="0" w:afterAutospacing="0" w:before="0" w:beforeAutospacing="0" w:line="240" w:lineRule="auto"/>
-        <w:ind w:left="720" w:hanging="360"/>
-        <w:jc w:val="both"/>
-        <w:rPr>
-          <w:u w:val="none"/>
-        </w:rPr>
-      </w:pPr>
-      <w:r>
-        <w:rPr>
-          <w:rtl w:val="0"/>
-        </w:rPr>
-        <w:t xml:space="preserve">Established a workflow for publishing private npm packages to the GitLab Registry, enabling efficient reuse of shared libraries, including the analytics library, across multiple applications.</w:t>
-      </w:r>
-    </w:p>
-    <w:p>
-      <w:pPr>
-        <w:pageBreakBefore w:val="0"/>
-        <w:numPr>
-          <w:ilvl w:val="0"/>
-          <w:numId w:val="1"/>
-        </w:numPr>
-        <w:pBdr>
-          <w:top w:space="0" w:sz="0" w:val="nil"/>
-          <w:left w:space="0" w:sz="0" w:val="nil"/>
-          <w:bottom w:space="0" w:sz="0" w:val="nil"/>
-          <w:right w:space="0" w:sz="0" w:val="nil"/>
-          <w:between w:space="0" w:sz="0" w:val="nil"/>
-        </w:pBdr>
-        <w:shd w:fill="auto" w:val="clear"/>
         <w:spacing w:before="0" w:beforeAutospacing="0" w:line="240" w:lineRule="auto"/>
         <w:ind w:left="720" w:hanging="360"/>
         <w:jc w:val="both"/>
-        <w:rPr>
-          <w:u w:val="none"/>
-        </w:rPr>
-      </w:pPr>
-      <w:r>
-        <w:rPr>
-          <w:rtl w:val="0"/>
-        </w:rPr>
-        <w:t xml:space="preserve">Documented technical processes related to URL and environment variable management using Markdown and incorporated AI tools such as GitHub Copilot and Claude into the development workflow.</w:t>
-      </w:r>
-    </w:p>
-    <w:p>
-      <w:pPr>
-        <w:pageBreakBefore w:val="0"/>
-        <w:pBdr>
-          <w:top w:space="0" w:sz="0" w:val="nil"/>
-          <w:left w:space="0" w:sz="0" w:val="nil"/>
-          <w:bottom w:space="0" w:sz="0" w:val="nil"/>
-          <w:right w:space="0" w:sz="0" w:val="nil"/>
-          <w:between w:space="0" w:sz="0" w:val="nil"/>
-        </w:pBdr>
-        <w:shd w:fill="auto" w:val="clear"/>
-        <w:spacing w:before="80" w:line="240" w:lineRule="auto"/>
+      </w:pPr>
+      <w:r>
+        <w:rPr>
+          <w:rtl w:val="0"/>
+        </w:rPr>
+        <w:t xml:space="preserve">Orchestrated front-end application integration with REST APIs, actively participating in architecture definition and inter-service communication contracts.</w:t>
+      </w:r>
+    </w:p>
+    <w:p>
+      <w:pPr>
+        <w:spacing w:before="200" w:line="240" w:lineRule="auto"/>
         <w:ind w:left="0" w:firstLine="0"/>
         <w:jc w:val="both"/>
         <w:rPr/>
       </w:pPr>
       <w:r>
         <w:rPr>
-          <w:i w:val="1"/>
-          <w:iCs w:val="1"/>
-          <w:rtl w:val="0"/>
-        </w:rPr>
-        <w:t xml:space="preserve">Tech Stack: React, Next.js, TypeScript, Mixpanel, AWS Redshift, AWS Athena, Braze SDK, Service Workers, Jest, npm, GitLab Registry, Markdown, IA (Copilot, Claude).</w:t>
-      </w:r>
-      <w:r>
-        <w:br w:type="page"/>
-      </w:r>
-      <w:r>
-        <w:rPr>
-          <w:rtl w:val="0"/>
-        </w:rPr>
-      </w:r>
-    </w:p>
-    <w:p>
-      <w:pPr>
-        <w:pStyle w:val="Heading2"/>
+          <w:b w:val="1"/>
+          <w:bCs w:val="1"/>
+          <w:rtl w:val="0"/>
+        </w:rPr>
+        <w:t xml:space="preserve">Tech Stack</w:t>
+      </w:r>
+      <w:r>
+        <w:rPr>
+          <w:rtl w:val="0"/>
+        </w:rPr>
+        <w:t xml:space="preserve">: React, TypeScript, Redux, SASS, LESS, Jest, React Testing Library, APIs REST.</w:t>
+      </w:r>
+    </w:p>
+    <w:p>
+      <w:pPr>
+        <w:pStyle w:val="Heading3"/>
         <w:keepNext w:val="0"/>
         <w:keepLines w:val="0"/>
-        <w:rPr>
-          <w:color w:val="666666"/>
-          <w:sz w:val="20"/>
-          <w:szCs w:val="20"/>
-        </w:rPr>
-      </w:pPr>
-      <w:bookmarkStart w:colFirst="0" w:colLast="0" w:name="_em3nacji519j" w:id="6"/>
-      <w:bookmarkEnd w:id="6"/>
-      <w:r>
-        <w:rPr>
-          <w:color w:val="000000"/>
-          <w:rtl w:val="0"/>
-        </w:rPr>
-        <w:t xml:space="preserve">Infoprice</w:t>
+        <w:rPr/>
+      </w:pPr>
+      <w:bookmarkStart w:colFirst="0" w:colLast="0" w:name="_xwuju1b8ahli" w:id="9"/>
+      <w:bookmarkEnd w:id="9"/>
+      <w:r>
+        <w:rPr>
+          <w:rtl w:val="0"/>
+        </w:rPr>
+        <w:t xml:space="preserve">Junior Front-end Developer</w:t>
       </w:r>
       <w:r>
         <w:rPr>
@@ -781,7 +791,7 @@
     </w:p>
     <w:tbl>
       <w:tblPr>
-        <w:tblStyle w:val="Table2"/>
+        <w:tblStyle w:val="Table3"/>
         <w:tblW w:w="9480.0" w:type="dxa"/>
         <w:jc w:val="left"/>
         <w:tblLayout w:type="fixed"/>
@@ -800,7 +810,6 @@
       <w:tr>
         <w:trPr>
           <w:cantSplit w:val="1"/>
-          <w:trHeight w:val="566.9291338582677" w:hRule="atLeast"/>
           <w:tblHeader w:val="0"/>
         </w:trPr>
         <w:tc>
@@ -826,7 +835,7 @@
                 <w:color w:val="666666"/>
                 <w:rtl w:val="0"/>
               </w:rPr>
-              <w:t xml:space="preserve">Front-end Developer</w:t>
+              <w:t xml:space="preserve">Bornlogic</w:t>
             </w:r>
           </w:p>
         </w:tc>
@@ -843,22 +852,24 @@
           </w:tcPr>
           <w:p>
             <w:pPr>
+              <w:pStyle w:val="Heading4"/>
               <w:spacing w:line="240" w:lineRule="auto"/>
               <w:jc w:val="right"/>
-              <w:rPr>
-                <w:color w:val="666666"/>
-                <w:sz w:val="20"/>
-                <w:szCs w:val="20"/>
-              </w:rPr>
+              <w:rPr/>
             </w:pPr>
+            <w:bookmarkStart w:colFirst="0" w:colLast="0" w:name="_6gbm8rkd6mj9" w:id="10"/>
+            <w:bookmarkEnd w:id="10"/>
             <w:r>
               <w:rPr>
-                <w:color w:val="666666"/>
-                <w:sz w:val="20"/>
-                <w:szCs w:val="20"/>
                 <w:rtl w:val="0"/>
               </w:rPr>
-              <w:t xml:space="preserve">JUNE 2023 — OCTOBER 2025</w:t>
+              <w:t xml:space="preserve">AUG </w:t>
+            </w:r>
+            <w:r>
+              <w:rPr>
+                <w:rtl w:val="0"/>
+              </w:rPr>
+              <w:t xml:space="preserve">2022 — JAN 2023</w:t>
             </w:r>
           </w:p>
         </w:tc>
@@ -870,18 +881,15 @@
           <w:ilvl w:val="0"/>
           <w:numId w:val="1"/>
         </w:numPr>
-        <w:spacing w:after="0" w:afterAutospacing="0" w:line="240" w:lineRule="auto"/>
+        <w:spacing w:after="0" w:afterAutospacing="0" w:before="200" w:line="240" w:lineRule="auto"/>
         <w:ind w:left="720" w:hanging="360"/>
         <w:jc w:val="both"/>
-        <w:rPr>
-          <w:u w:val="none"/>
-        </w:rPr>
-      </w:pPr>
-      <w:r>
-        <w:rPr>
-          <w:rtl w:val="0"/>
-        </w:rPr>
-        <w:t xml:space="preserve">Developed and maintained the front end of a B2B SaaS pricing platform used by more than 27,000 stores, using React, TypeScript, and Redux for global state management.</w:t>
+      </w:pPr>
+      <w:r>
+        <w:rPr>
+          <w:rtl w:val="0"/>
+        </w:rPr>
+        <w:t xml:space="preserve">Led the front-end evolution of a B2B SaaS pricing platform for 27,000 stores, using React, TypeScript and Redux to ensure scalability and performance.</w:t>
       </w:r>
     </w:p>
     <w:p>
@@ -893,15 +901,12 @@
         <w:spacing w:after="0" w:afterAutospacing="0" w:before="0" w:beforeAutospacing="0" w:line="240" w:lineRule="auto"/>
         <w:ind w:left="720" w:hanging="360"/>
         <w:jc w:val="both"/>
-        <w:rPr>
-          <w:u w:val="none"/>
-        </w:rPr>
-      </w:pPr>
-      <w:r>
-        <w:rPr>
-          <w:rtl w:val="0"/>
-        </w:rPr>
-        <w:t xml:space="preserve">Developed and evolved Design System components using SASS and LESS, promoting visual consistency and code reuse.</w:t>
+      </w:pPr>
+      <w:r>
+        <w:rPr>
+          <w:rtl w:val="0"/>
+        </w:rPr>
+        <w:t xml:space="preserve">Optimized the development cycle by 30% by standardizing components in the Design System with SASS and LESS, ensuring visual consistency and high code reuse.</w:t>
       </w:r>
     </w:p>
     <w:p>
@@ -913,15 +918,12 @@
         <w:spacing w:after="0" w:afterAutospacing="0" w:before="0" w:beforeAutospacing="0" w:line="240" w:lineRule="auto"/>
         <w:ind w:left="720" w:hanging="360"/>
         <w:jc w:val="both"/>
-        <w:rPr>
-          <w:u w:val="none"/>
-        </w:rPr>
-      </w:pPr>
-      <w:r>
-        <w:rPr>
-          <w:rtl w:val="0"/>
-        </w:rPr>
-        <w:t xml:space="preserve">Implemented automated tests with Jest and React Testing Library, covering critical business scenarios and increasing delivery reliability.</w:t>
+      </w:pPr>
+      <w:r>
+        <w:rPr>
+          <w:rtl w:val="0"/>
+        </w:rPr>
+        <w:t xml:space="preserve">Mitigated 40% of production bugs by implementing automated tests with Jest and React Testing Library, reaching 80% coverage on critical business flows.</w:t>
       </w:r>
     </w:p>
     <w:p>
@@ -933,34 +935,59 @@
         <w:spacing w:before="0" w:beforeAutospacing="0" w:line="240" w:lineRule="auto"/>
         <w:ind w:left="720" w:hanging="360"/>
         <w:jc w:val="both"/>
-        <w:rPr>
-          <w:u w:val="none"/>
-        </w:rPr>
-      </w:pPr>
-      <w:r>
-        <w:rPr>
-          <w:rtl w:val="0"/>
-        </w:rPr>
-        <w:t xml:space="preserve">Integrated front-end applications with back-end services through REST APIs, actively participating in architectural decisions and API contract design.</w:t>
-      </w:r>
-    </w:p>
-    <w:p>
-      <w:pPr>
-        <w:spacing w:line="240" w:lineRule="auto"/>
+      </w:pPr>
+      <w:r>
+        <w:rPr>
+          <w:rtl w:val="0"/>
+        </w:rPr>
+        <w:t xml:space="preserve">Orchestrated front-end application integration with REST APIs, actively participating in architecture definition and inter-service communication contracts.</w:t>
+      </w:r>
+    </w:p>
+    <w:p>
+      <w:pPr>
+        <w:spacing w:before="200" w:line="240" w:lineRule="auto"/>
         <w:ind w:left="0" w:firstLine="0"/>
         <w:jc w:val="both"/>
-        <w:rPr>
-          <w:i w:val="1"/>
-          <w:iCs w:val="1"/>
-        </w:rPr>
-      </w:pPr>
-      <w:r>
-        <w:rPr>
-          <w:i w:val="1"/>
-          <w:iCs w:val="1"/>
-          <w:rtl w:val="0"/>
-        </w:rPr>
-        <w:t xml:space="preserve">Tech Stack: React, TypeScript, Redux, SASS, LESS, Jest, React Testing Library, APIs REST.</w:t>
+        <w:rPr/>
+      </w:pPr>
+      <w:r>
+        <w:rPr>
+          <w:b w:val="1"/>
+          <w:bCs w:val="1"/>
+          <w:rtl w:val="0"/>
+        </w:rPr>
+        <w:t xml:space="preserve">Tech Stack</w:t>
+      </w:r>
+      <w:r>
+        <w:rPr>
+          <w:rtl w:val="0"/>
+        </w:rPr>
+        <w:t xml:space="preserve">: React, TypeScript, Styled-components, Storybook, MDX, Jest, React Testing Library.</w:t>
+      </w:r>
+      <w:r>
+        <w:rPr>
+          <w:rtl w:val="0"/>
+        </w:rPr>
+      </w:r>
+    </w:p>
+    <w:p>
+      <w:pPr>
+        <w:ind w:firstLine="0"/>
+        <w:rPr>
+          <w:sz w:val="24"/>
+          <w:szCs w:val="24"/>
+          <w:highlight w:val="white"/>
+        </w:rPr>
+      </w:pPr>
+      <w:r>
+        <w:pict>
+          <v:rect style="width:0.0pt;height:1.5pt" o:hr="t" o:hrstd="t" o:hralign="center" fillcolor="#A0A0A0" stroked="f"/>
+        </w:pict>
+      </w:r>
+      <w:r>
+        <w:rPr>
+          <w:rtl w:val="0"/>
+        </w:rPr>
       </w:r>
     </w:p>
     <w:p>
@@ -968,49 +995,61 @@
         <w:pStyle w:val="Heading2"/>
         <w:keepNext w:val="0"/>
         <w:keepLines w:val="0"/>
-        <w:rPr>
-          <w:color w:val="666666"/>
-          <w:sz w:val="20"/>
-          <w:szCs w:val="20"/>
-        </w:rPr>
-      </w:pPr>
-      <w:bookmarkStart w:colFirst="0" w:colLast="0" w:name="_xwuju1b8ahli" w:id="7"/>
-      <w:bookmarkEnd w:id="7"/>
-      <w:r>
-        <w:rPr>
-          <w:color w:val="000000"/>
-          <w:rtl w:val="0"/>
-        </w:rPr>
-        <w:t xml:space="preserve">Bornlogic</w:t>
-      </w:r>
-      <w:r>
-        <w:rPr>
-          <w:rtl w:val="0"/>
-        </w:rPr>
+        <w:spacing w:after="200" w:before="200" w:lineRule="auto"/>
+        <w:rPr/>
+      </w:pPr>
+      <w:bookmarkStart w:colFirst="0" w:colLast="0" w:name="_pwnp1k6vsbh1" w:id="11"/>
+      <w:bookmarkEnd w:id="11"/>
+      <w:r>
+        <w:rPr>
+          <w:rtl w:val="0"/>
+        </w:rPr>
+        <w:t xml:space="preserve">EDUCATION</w:t>
+      </w:r>
+      <w:r>
+        <w:rPr>
+          <w:rtl w:val="0"/>
+        </w:rPr>
+      </w:r>
+    </w:p>
+    <w:p>
+      <w:pPr>
+        <w:pStyle w:val="Heading3"/>
+        <w:keepNext w:val="0"/>
+        <w:keepLines w:val="0"/>
+        <w:spacing w:before="0" w:line="276" w:lineRule="auto"/>
+        <w:rPr/>
+      </w:pPr>
+      <w:bookmarkStart w:colFirst="0" w:colLast="0" w:name="_5rlytc7vh7ay" w:id="12"/>
+      <w:bookmarkEnd w:id="12"/>
+      <w:r>
+        <w:rPr>
+          <w:rtl w:val="0"/>
+        </w:rPr>
+        <w:t xml:space="preserve">Estácio</w:t>
       </w:r>
     </w:p>
     <w:tbl>
       <w:tblPr>
-        <w:tblStyle w:val="Table3"/>
-        <w:tblW w:w="9480.0" w:type="dxa"/>
+        <w:tblStyle w:val="Table4"/>
+        <w:tblW w:w="9378.0" w:type="dxa"/>
         <w:jc w:val="left"/>
         <w:tblLayout w:type="fixed"/>
         <w:tblLook w:val="0600"/>
       </w:tblPr>
       <w:tblGrid>
-        <w:gridCol w:w="4740"/>
-        <w:gridCol w:w="4740"/>
+        <w:gridCol w:w="4689"/>
+        <w:gridCol w:w="4689"/>
         <w:tblGridChange w:id="0">
           <w:tblGrid>
-            <w:gridCol w:w="4740"/>
-            <w:gridCol w:w="4740"/>
+            <w:gridCol w:w="4689"/>
+            <w:gridCol w:w="4689"/>
           </w:tblGrid>
         </w:tblGridChange>
       </w:tblGrid>
       <w:tr>
         <w:trPr>
-          <w:cantSplit w:val="1"/>
-          <w:trHeight w:val="566.9291338582677" w:hRule="atLeast"/>
+          <w:cantSplit w:val="0"/>
           <w:tblHeader w:val="0"/>
         </w:trPr>
         <w:tc>
@@ -1022,21 +1061,18 @@
               <w:bottom w:w="0.0" w:type="dxa"/>
               <w:right w:w="0.0" w:type="dxa"/>
             </w:tcMar>
-            <w:vAlign w:val="center"/>
+            <w:vAlign w:val="top"/>
           </w:tcPr>
           <w:p>
             <w:pPr>
-              <w:spacing w:line="240" w:lineRule="auto"/>
-              <w:rPr>
-                <w:color w:val="666666"/>
-              </w:rPr>
+              <w:spacing w:before="0" w:lineRule="auto"/>
+              <w:rPr/>
             </w:pPr>
             <w:r>
               <w:rPr>
-                <w:color w:val="666666"/>
                 <w:rtl w:val="0"/>
               </w:rPr>
-              <w:t xml:space="preserve">Front-end Developer</w:t>
+              <w:t xml:space="preserve">Systems Analysis and Development</w:t>
             </w:r>
           </w:p>
         </w:tc>
@@ -1049,285 +1085,27 @@
               <w:bottom w:w="0.0" w:type="dxa"/>
               <w:right w:w="0.0" w:type="dxa"/>
             </w:tcMar>
-            <w:vAlign w:val="center"/>
+            <w:vAlign w:val="top"/>
           </w:tcPr>
           <w:p>
             <w:pPr>
-              <w:spacing w:line="240" w:lineRule="auto"/>
-              <w:jc w:val="right"/>
-              <w:rPr>
-                <w:color w:val="666666"/>
-                <w:sz w:val="20"/>
-                <w:szCs w:val="20"/>
-              </w:rPr>
+              <w:pStyle w:val="Heading4"/>
+              <w:widowControl w:val="0"/>
+              <w:spacing w:before="0" w:line="240" w:lineRule="auto"/>
+              <w:rPr/>
             </w:pPr>
+            <w:bookmarkStart w:colFirst="0" w:colLast="0" w:name="_ww244w94lp1r" w:id="13"/>
+            <w:bookmarkEnd w:id="13"/>
             <w:r>
               <w:rPr>
-                <w:color w:val="666666"/>
-                <w:sz w:val="20"/>
-                <w:szCs w:val="20"/>
                 <w:rtl w:val="0"/>
               </w:rPr>
-              <w:t xml:space="preserve">AUGUST 2022 — JANUARY 2023</w:t>
+              <w:t xml:space="preserve">2020 — 2023</w:t>
             </w:r>
           </w:p>
         </w:tc>
       </w:tr>
     </w:tbl>
-    <w:p>
-      <w:pPr>
-        <w:numPr>
-          <w:ilvl w:val="0"/>
-          <w:numId w:val="1"/>
-        </w:numPr>
-        <w:spacing w:after="0" w:afterAutospacing="0" w:line="240" w:lineRule="auto"/>
-        <w:ind w:left="720" w:hanging="360"/>
-        <w:jc w:val="both"/>
-        <w:rPr>
-          <w:highlight w:val="white"/>
-        </w:rPr>
-      </w:pPr>
-      <w:r>
-        <w:rPr>
-          <w:rtl w:val="0"/>
-        </w:rPr>
-        <w:t xml:space="preserve">Structured the company's Design System using Storybook and MDX, establishing an environment for component development, documentation, and reuse.</w:t>
-      </w:r>
-    </w:p>
-    <w:p>
-      <w:pPr>
-        <w:numPr>
-          <w:ilvl w:val="0"/>
-          <w:numId w:val="1"/>
-        </w:numPr>
-        <w:spacing w:after="0" w:afterAutospacing="0" w:before="0" w:beforeAutospacing="0" w:line="240" w:lineRule="auto"/>
-        <w:ind w:left="720" w:hanging="360"/>
-        <w:jc w:val="both"/>
-        <w:rPr>
-          <w:u w:val="none"/>
-        </w:rPr>
-      </w:pPr>
-      <w:r>
-        <w:rPr>
-          <w:rtl w:val="0"/>
-        </w:rPr>
-        <w:t xml:space="preserve">Developed scalable, responsive, and accessible UI components using React and TypeScript, with styles encapsulated through Styled-components.</w:t>
-      </w:r>
-    </w:p>
-    <w:p>
-      <w:pPr>
-        <w:numPr>
-          <w:ilvl w:val="0"/>
-          <w:numId w:val="1"/>
-        </w:numPr>
-        <w:spacing w:after="0" w:afterAutospacing="0" w:before="0" w:beforeAutospacing="0" w:line="240" w:lineRule="auto"/>
-        <w:ind w:left="720" w:hanging="360"/>
-        <w:jc w:val="both"/>
-        <w:rPr>
-          <w:u w:val="none"/>
-        </w:rPr>
-      </w:pPr>
-      <w:r>
-        <w:rPr>
-          <w:rtl w:val="0"/>
-        </w:rPr>
-        <w:t xml:space="preserve">Implemented automated tests with Jest and React Testing Library, covering critical component behavior and reducing regressions in production.</w:t>
-      </w:r>
-    </w:p>
-    <w:p>
-      <w:pPr>
-        <w:numPr>
-          <w:ilvl w:val="0"/>
-          <w:numId w:val="1"/>
-        </w:numPr>
-        <w:spacing w:after="0" w:afterAutospacing="0" w:before="0" w:beforeAutospacing="0" w:line="240" w:lineRule="auto"/>
-        <w:ind w:left="720" w:hanging="360"/>
-        <w:jc w:val="both"/>
-        <w:rPr>
-          <w:u w:val="none"/>
-        </w:rPr>
-      </w:pPr>
-      <w:r>
-        <w:rPr>
-          <w:rtl w:val="0"/>
-        </w:rPr>
-        <w:t xml:space="preserve">Participated in code reviews through Pull Requests, contributing to technical standardization and code quality.</w:t>
-      </w:r>
-    </w:p>
-    <w:p>
-      <w:pPr>
-        <w:numPr>
-          <w:ilvl w:val="0"/>
-          <w:numId w:val="1"/>
-        </w:numPr>
-        <w:spacing w:before="0" w:beforeAutospacing="0" w:line="240" w:lineRule="auto"/>
-        <w:ind w:left="720" w:hanging="360"/>
-        <w:jc w:val="both"/>
-        <w:rPr>
-          <w:u w:val="none"/>
-        </w:rPr>
-      </w:pPr>
-      <w:r>
-        <w:rPr>
-          <w:rtl w:val="0"/>
-        </w:rPr>
-        <w:t xml:space="preserve">Maintained technical documentation related to the Quality Management System (QMS), ensuring compliance with development processes.</w:t>
-      </w:r>
-    </w:p>
-    <w:p>
-      <w:pPr>
-        <w:spacing w:line="240" w:lineRule="auto"/>
-        <w:ind w:left="0" w:firstLine="0"/>
-        <w:jc w:val="both"/>
-        <w:rPr>
-          <w:i w:val="1"/>
-          <w:iCs w:val="1"/>
-        </w:rPr>
-      </w:pPr>
-      <w:r>
-        <w:rPr>
-          <w:i w:val="1"/>
-          <w:iCs w:val="1"/>
-          <w:rtl w:val="0"/>
-        </w:rPr>
-        <w:t xml:space="preserve">Tech Stack: React, TypeScript, Styled-components, Storybook, MDX, Jest, React Testing Library.</w:t>
-      </w:r>
-      <w:r>
-        <w:rPr>
-          <w:rtl w:val="0"/>
-        </w:rPr>
-      </w:r>
-    </w:p>
-    <w:p>
-      <w:pPr>
-        <w:ind w:firstLine="0"/>
-        <w:rPr>
-          <w:sz w:val="24"/>
-          <w:szCs w:val="24"/>
-          <w:highlight w:val="white"/>
-        </w:rPr>
-      </w:pPr>
-      <w:r>
-        <w:pict>
-          <v:rect style="width:0.0pt;height:1.5pt" o:hr="t" o:hrstd="t" o:hralign="center" fillcolor="#A0A0A0" stroked="f"/>
-        </w:pict>
-      </w:r>
-      <w:r>
-        <w:rPr>
-          <w:rtl w:val="0"/>
-        </w:rPr>
-      </w:r>
-    </w:p>
-    <w:p>
-      <w:pPr>
-        <w:pStyle w:val="Heading1"/>
-        <w:keepNext w:val="0"/>
-        <w:keepLines w:val="0"/>
-        <w:pageBreakBefore w:val="0"/>
-        <w:pBdr>
-          <w:top w:space="0" w:sz="0" w:val="nil"/>
-          <w:left w:space="0" w:sz="0" w:val="nil"/>
-          <w:bottom w:space="0" w:sz="0" w:val="nil"/>
-          <w:right w:space="0" w:sz="0" w:val="nil"/>
-          <w:between w:space="0" w:sz="0" w:val="nil"/>
-        </w:pBdr>
-        <w:shd w:fill="auto" w:val="clear"/>
-        <w:spacing w:after="200" w:before="200" w:line="240" w:lineRule="auto"/>
-        <w:rPr>
-          <w:rFonts w:ascii="Proxima Nova" w:cs="Proxima Nova" w:eastAsia="Proxima Nova" w:hAnsi="Proxima Nova"/>
-          <w:b w:val="1"/>
-          <w:bCs w:val="1"/>
-          <w:color w:val="c18c5d"/>
-          <w:sz w:val="30"/>
-          <w:szCs w:val="30"/>
-        </w:rPr>
-      </w:pPr>
-      <w:bookmarkStart w:colFirst="0" w:colLast="0" w:name="_pwnp1k6vsbh1" w:id="8"/>
-      <w:bookmarkEnd w:id="8"/>
-      <w:r>
-        <w:rPr>
-          <w:color w:val="c18c5d"/>
-          <w:sz w:val="30"/>
-          <w:szCs w:val="30"/>
-          <w:rtl w:val="0"/>
-        </w:rPr>
-        <w:t xml:space="preserve">FORMAÇÃO ACADÊMICA</w:t>
-      </w:r>
-      <w:r>
-        <w:rPr>
-          <w:rtl w:val="0"/>
-        </w:rPr>
-      </w:r>
-    </w:p>
-    <w:p>
-      <w:pPr>
-        <w:pStyle w:val="Heading2"/>
-        <w:keepNext w:val="0"/>
-        <w:keepLines w:val="0"/>
-        <w:spacing w:before="0" w:lineRule="auto"/>
-        <w:rPr>
-          <w:color w:val="000000"/>
-        </w:rPr>
-      </w:pPr>
-      <w:bookmarkStart w:colFirst="0" w:colLast="0" w:name="_5rlytc7vh7ay" w:id="9"/>
-      <w:bookmarkEnd w:id="9"/>
-      <w:r>
-        <w:rPr>
-          <w:color w:val="000000"/>
-          <w:rtl w:val="0"/>
-        </w:rPr>
-        <w:t xml:space="preserve">Estácio</w:t>
-      </w:r>
-      <w:r>
-        <w:rPr>
-          <w:rtl w:val="0"/>
-        </w:rPr>
-      </w:r>
-    </w:p>
-    <w:p>
-      <w:pPr>
-        <w:pStyle w:val="Heading2"/>
-        <w:spacing w:before="0" w:lineRule="auto"/>
-        <w:rPr/>
-      </w:pPr>
-      <w:bookmarkStart w:colFirst="0" w:colLast="0" w:name="_by53aibnagcg" w:id="10"/>
-      <w:bookmarkEnd w:id="10"/>
-      <w:r>
-        <w:rPr>
-          <w:rtl w:val="0"/>
-        </w:rPr>
-        <w:t xml:space="preserve">Análise de Sistemas de Computação</w:t>
-      </w:r>
-      <w:r>
-        <w:rPr>
-          <w:rtl w:val="0"/>
-        </w:rPr>
-      </w:r>
-    </w:p>
-    <w:p>
-      <w:pPr>
-        <w:spacing w:line="240" w:lineRule="auto"/>
-        <w:rPr>
-          <w:color w:val="666666"/>
-          <w:sz w:val="20"/>
-          <w:szCs w:val="20"/>
-        </w:rPr>
-      </w:pPr>
-      <w:r>
-        <w:rPr>
-          <w:color w:val="666666"/>
-          <w:sz w:val="20"/>
-          <w:szCs w:val="20"/>
-          <w:rtl w:val="0"/>
-        </w:rPr>
-        <w:t xml:space="preserve">2020 - 2023</w:t>
-      </w:r>
-      <w:r>
-        <w:rPr>
-          <w:rtl w:val="0"/>
-        </w:rPr>
-      </w:r>
-    </w:p>
     <w:p>
       <w:pPr>
         <w:pageBreakBefore w:val="0"/>
@@ -1355,250 +1133,158 @@
     </w:p>
     <w:p>
       <w:pPr>
-        <w:pStyle w:val="Heading1"/>
-        <w:keepNext w:val="0"/>
-        <w:keepLines w:val="0"/>
-        <w:pageBreakBefore w:val="0"/>
-        <w:pBdr>
-          <w:top w:space="0" w:sz="0" w:val="nil"/>
-          <w:left w:space="0" w:sz="0" w:val="nil"/>
-          <w:bottom w:space="0" w:sz="0" w:val="nil"/>
-          <w:right w:space="0" w:sz="0" w:val="nil"/>
-          <w:between w:space="0" w:sz="0" w:val="nil"/>
-        </w:pBdr>
-        <w:shd w:fill="auto" w:val="clear"/>
-        <w:spacing w:after="200" w:before="200" w:line="240" w:lineRule="auto"/>
-        <w:rPr>
-          <w:rFonts w:ascii="Proxima Nova" w:cs="Proxima Nova" w:eastAsia="Proxima Nova" w:hAnsi="Proxima Nova"/>
+        <w:pStyle w:val="Heading2"/>
+        <w:rPr/>
+      </w:pPr>
+      <w:bookmarkStart w:colFirst="0" w:colLast="0" w:name="_2jqvh01mc2lp" w:id="14"/>
+      <w:bookmarkEnd w:id="14"/>
+      <w:r>
+        <w:rPr>
+          <w:rtl w:val="0"/>
+        </w:rPr>
+        <w:t xml:space="preserve">LANGUAGE</w:t>
+      </w:r>
+    </w:p>
+    <w:p>
+      <w:pPr>
+        <w:rPr/>
+      </w:pPr>
+      <w:r>
+        <w:rPr>
           <w:b w:val="1"/>
           <w:bCs w:val="1"/>
-          <w:color w:val="c18c5d"/>
-          <w:sz w:val="30"/>
-          <w:szCs w:val="30"/>
-        </w:rPr>
-      </w:pPr>
-      <w:bookmarkStart w:colFirst="0" w:colLast="0" w:name="_3hy8rkwzatey" w:id="11"/>
-      <w:bookmarkEnd w:id="11"/>
-      <w:r>
-        <w:rPr>
-          <w:color w:val="c18c5d"/>
-          <w:sz w:val="30"/>
-          <w:szCs w:val="30"/>
-          <w:rtl w:val="0"/>
-        </w:rPr>
-        <w:t xml:space="preserve">INFORMAÇÕES COMPLEMENTARES  </w:t>
-      </w:r>
-      <w:r>
-        <w:rPr>
-          <w:rtl w:val="0"/>
-        </w:rPr>
-      </w:r>
-    </w:p>
-    <w:p>
-      <w:pPr>
-        <w:pageBreakBefore w:val="0"/>
-        <w:numPr>
-          <w:ilvl w:val="0"/>
-          <w:numId w:val="2"/>
-        </w:numPr>
-        <w:pBdr>
-          <w:top w:space="0" w:sz="0" w:val="nil"/>
-          <w:left w:space="0" w:sz="0" w:val="nil"/>
-          <w:bottom w:space="0" w:sz="0" w:val="nil"/>
-          <w:right w:space="0" w:sz="0" w:val="nil"/>
-          <w:between w:space="0" w:sz="0" w:val="nil"/>
-        </w:pBdr>
-        <w:shd w:fill="auto" w:val="clear"/>
-        <w:spacing w:after="0" w:afterAutospacing="0" w:before="80" w:line="288" w:lineRule="auto"/>
-        <w:ind w:left="720" w:hanging="360"/>
-        <w:rPr>
-          <w:sz w:val="24"/>
-          <w:szCs w:val="24"/>
-        </w:rPr>
-      </w:pPr>
-      <w:r>
-        <w:rPr>
-          <w:sz w:val="24"/>
-          <w:szCs w:val="24"/>
-          <w:rtl w:val="0"/>
-        </w:rPr>
-        <w:t xml:space="preserve">Inglês — Avançado</w:t>
-      </w:r>
-    </w:p>
-    <w:p>
-      <w:pPr>
-        <w:pageBreakBefore w:val="0"/>
-        <w:numPr>
-          <w:ilvl w:val="0"/>
-          <w:numId w:val="2"/>
-        </w:numPr>
-        <w:pBdr>
-          <w:top w:space="0" w:sz="0" w:val="nil"/>
-          <w:left w:space="0" w:sz="0" w:val="nil"/>
-          <w:bottom w:space="0" w:sz="0" w:val="nil"/>
-          <w:right w:space="0" w:sz="0" w:val="nil"/>
-          <w:between w:space="0" w:sz="0" w:val="nil"/>
-        </w:pBdr>
-        <w:shd w:fill="auto" w:val="clear"/>
-        <w:spacing w:after="0" w:afterAutospacing="0" w:before="0" w:beforeAutospacing="0" w:line="288" w:lineRule="auto"/>
-        <w:ind w:left="720" w:hanging="360"/>
-        <w:rPr>
-          <w:sz w:val="24"/>
-          <w:szCs w:val="24"/>
-          <w:u w:val="none"/>
-        </w:rPr>
-      </w:pPr>
-      <w:r>
-        <w:rPr>
-          <w:sz w:val="24"/>
-          <w:szCs w:val="24"/>
-          <w:rtl w:val="0"/>
-        </w:rPr>
-        <w:t xml:space="preserve">Curso: React Avançado — Origamid (out/2025)</w:t>
-      </w:r>
-    </w:p>
-    <w:p>
-      <w:pPr>
-        <w:pageBreakBefore w:val="0"/>
-        <w:numPr>
-          <w:ilvl w:val="0"/>
-          <w:numId w:val="2"/>
-        </w:numPr>
-        <w:pBdr>
-          <w:top w:space="0" w:sz="0" w:val="nil"/>
-          <w:left w:space="0" w:sz="0" w:val="nil"/>
-          <w:bottom w:space="0" w:sz="0" w:val="nil"/>
-          <w:right w:space="0" w:sz="0" w:val="nil"/>
-          <w:between w:space="0" w:sz="0" w:val="nil"/>
-        </w:pBdr>
-        <w:shd w:fill="auto" w:val="clear"/>
-        <w:spacing w:after="0" w:afterAutospacing="0" w:before="0" w:beforeAutospacing="0" w:line="288" w:lineRule="auto"/>
-        <w:ind w:left="720" w:hanging="360"/>
-        <w:rPr>
-          <w:sz w:val="24"/>
-          <w:szCs w:val="24"/>
-          <w:u w:val="none"/>
-        </w:rPr>
-      </w:pPr>
-      <w:r>
-        <w:rPr>
-          <w:sz w:val="24"/>
-          <w:szCs w:val="24"/>
-          <w:rtl w:val="0"/>
-        </w:rPr>
-        <w:t xml:space="preserve">Curso: JavaScript ES6+ — Origamid (mar/2022)</w:t>
-      </w:r>
-    </w:p>
-    <w:p>
-      <w:pPr>
-        <w:pageBreakBefore w:val="0"/>
-        <w:numPr>
-          <w:ilvl w:val="0"/>
-          <w:numId w:val="2"/>
-        </w:numPr>
-        <w:pBdr>
-          <w:top w:space="0" w:sz="0" w:val="nil"/>
-          <w:left w:space="0" w:sz="0" w:val="nil"/>
-          <w:bottom w:space="0" w:sz="0" w:val="nil"/>
-          <w:right w:space="0" w:sz="0" w:val="nil"/>
-          <w:between w:space="0" w:sz="0" w:val="nil"/>
-        </w:pBdr>
-        <w:shd w:fill="auto" w:val="clear"/>
-        <w:spacing w:after="0" w:afterAutospacing="0" w:before="0" w:beforeAutospacing="0" w:line="288" w:lineRule="auto"/>
-        <w:ind w:left="720" w:hanging="360"/>
-        <w:rPr>
-          <w:sz w:val="24"/>
-          <w:szCs w:val="24"/>
-          <w:u w:val="none"/>
-        </w:rPr>
-      </w:pPr>
-      <w:r>
-        <w:rPr>
-          <w:sz w:val="24"/>
-          <w:szCs w:val="24"/>
-          <w:rtl w:val="0"/>
-        </w:rPr>
-        <w:t xml:space="preserve">Curso: CSS Flexbox — Origamid (jun/2021)</w:t>
-      </w:r>
-    </w:p>
-    <w:p>
-      <w:pPr>
-        <w:pageBreakBefore w:val="0"/>
-        <w:numPr>
-          <w:ilvl w:val="0"/>
-          <w:numId w:val="2"/>
-        </w:numPr>
-        <w:pBdr>
-          <w:top w:space="0" w:sz="0" w:val="nil"/>
-          <w:left w:space="0" w:sz="0" w:val="nil"/>
-          <w:bottom w:space="0" w:sz="0" w:val="nil"/>
-          <w:right w:space="0" w:sz="0" w:val="nil"/>
-          <w:between w:space="0" w:sz="0" w:val="nil"/>
-        </w:pBdr>
-        <w:shd w:fill="auto" w:val="clear"/>
-        <w:spacing w:after="0" w:afterAutospacing="0" w:before="0" w:beforeAutospacing="0" w:line="288" w:lineRule="auto"/>
-        <w:ind w:left="720" w:hanging="360"/>
-        <w:rPr>
-          <w:sz w:val="24"/>
-          <w:szCs w:val="24"/>
-          <w:u w:val="none"/>
-        </w:rPr>
-      </w:pPr>
-      <w:r>
-        <w:rPr>
-          <w:sz w:val="24"/>
-          <w:szCs w:val="24"/>
-          <w:rtl w:val="0"/>
-        </w:rPr>
-        <w:t xml:space="preserve">Curso: CSS grid Layout — Origamid (jun/2021)</w:t>
-      </w:r>
-    </w:p>
-    <w:p>
-      <w:pPr>
-        <w:pageBreakBefore w:val="0"/>
-        <w:numPr>
-          <w:ilvl w:val="0"/>
-          <w:numId w:val="2"/>
-        </w:numPr>
-        <w:pBdr>
-          <w:top w:space="0" w:sz="0" w:val="nil"/>
-          <w:left w:space="0" w:sz="0" w:val="nil"/>
-          <w:bottom w:space="0" w:sz="0" w:val="nil"/>
-          <w:right w:space="0" w:sz="0" w:val="nil"/>
-          <w:between w:space="0" w:sz="0" w:val="nil"/>
-        </w:pBdr>
-        <w:shd w:fill="auto" w:val="clear"/>
-        <w:spacing w:before="0" w:beforeAutospacing="0" w:line="288" w:lineRule="auto"/>
-        <w:ind w:left="720" w:hanging="360"/>
-        <w:rPr>
-          <w:sz w:val="24"/>
-          <w:szCs w:val="24"/>
-          <w:u w:val="none"/>
-        </w:rPr>
-      </w:pPr>
-      <w:r>
-        <w:rPr>
-          <w:sz w:val="24"/>
-          <w:szCs w:val="24"/>
-          <w:rtl w:val="0"/>
-        </w:rPr>
-        <w:t xml:space="preserve">Curso: Desenvolvimento Web — Hcode (</w:t>
-      </w:r>
-      <w:r>
-        <w:rPr>
-          <w:sz w:val="24"/>
-          <w:szCs w:val="24"/>
-          <w:rtl w:val="0"/>
-        </w:rPr>
-        <w:t xml:space="preserve">mai</w:t>
-      </w:r>
-      <w:r>
-        <w:rPr>
-          <w:sz w:val="24"/>
-          <w:szCs w:val="24"/>
-          <w:rtl w:val="0"/>
-        </w:rPr>
-        <w:t xml:space="preserve">/2021)</w:t>
+          <w:rtl w:val="0"/>
+        </w:rPr>
+        <w:t xml:space="preserve">Portuguese </w:t>
+      </w:r>
+      <w:r>
+        <w:rPr>
+          <w:rtl w:val="0"/>
+        </w:rPr>
+        <w:t xml:space="preserve">— Native</w:t>
+      </w:r>
+    </w:p>
+    <w:p>
+      <w:pPr>
+        <w:rPr/>
+      </w:pPr>
+      <w:r>
+        <w:rPr>
+          <w:b w:val="1"/>
+          <w:bCs w:val="1"/>
+          <w:rtl w:val="0"/>
+        </w:rPr>
+        <w:t xml:space="preserve">English </w:t>
+      </w:r>
+      <w:r>
+        <w:rPr>
+          <w:rtl w:val="0"/>
+        </w:rPr>
+        <w:t xml:space="preserve">— Advanced</w:t>
+      </w:r>
+    </w:p>
+    <w:p>
+      <w:pPr>
+        <w:rPr/>
+      </w:pPr>
+      <w:r>
+        <w:pict>
+          <v:rect style="width:0.0pt;height:1.5pt" o:hr="t" o:hrstd="t" o:hralign="center" fillcolor="#A0A0A0" stroked="f"/>
+        </w:pict>
+      </w:r>
+      <w:r>
+        <w:rPr>
+          <w:rtl w:val="0"/>
+        </w:rPr>
+      </w:r>
+    </w:p>
+    <w:p>
+      <w:pPr>
+        <w:pStyle w:val="Heading2"/>
+        <w:rPr/>
+      </w:pPr>
+      <w:bookmarkStart w:colFirst="0" w:colLast="0" w:name="_hs1ojr4rehux" w:id="15"/>
+      <w:bookmarkEnd w:id="15"/>
+      <w:r>
+        <w:rPr>
+          <w:rtl w:val="0"/>
+        </w:rPr>
+        <w:t xml:space="preserve">CERTIFICATIONS</w:t>
+      </w:r>
+    </w:p>
+    <w:p>
+      <w:pPr>
+        <w:rPr/>
+      </w:pPr>
+      <w:r>
+        <w:rPr>
+          <w:b w:val="1"/>
+          <w:bCs w:val="1"/>
+          <w:rtl w:val="0"/>
+        </w:rPr>
+        <w:t xml:space="preserve">Next.js</w:t>
+      </w:r>
+      <w:r>
+        <w:rPr>
+          <w:rtl w:val="0"/>
+        </w:rPr>
+        <w:t xml:space="preserve"> - Origamid (nov/2025), </w:t>
+      </w:r>
+      <w:r>
+        <w:rPr>
+          <w:b w:val="1"/>
+          <w:bCs w:val="1"/>
+          <w:rtl w:val="0"/>
+        </w:rPr>
+        <w:t xml:space="preserve">React Avançado</w:t>
+      </w:r>
+      <w:r>
+        <w:rPr>
+          <w:rtl w:val="0"/>
+        </w:rPr>
+        <w:t xml:space="preserve"> - Origamid (out/2025), </w:t>
+      </w:r>
+      <w:r>
+        <w:rPr>
+          <w:b w:val="1"/>
+          <w:bCs w:val="1"/>
+          <w:rtl w:val="0"/>
+        </w:rPr>
+        <w:t xml:space="preserve">JavaScript ES6+</w:t>
+      </w:r>
+      <w:r>
+        <w:rPr>
+          <w:rtl w:val="0"/>
+        </w:rPr>
+        <w:t xml:space="preserve"> - Origamid (mar/2022), </w:t>
+      </w:r>
+      <w:r>
+        <w:rPr>
+          <w:b w:val="1"/>
+          <w:bCs w:val="1"/>
+          <w:rtl w:val="0"/>
+        </w:rPr>
+        <w:t xml:space="preserve">CSS Flexbox</w:t>
+      </w:r>
+      <w:r>
+        <w:rPr>
+          <w:rtl w:val="0"/>
+        </w:rPr>
+        <w:t xml:space="preserve"> - Origamid (jun/2021), </w:t>
+      </w:r>
+      <w:r>
+        <w:rPr>
+          <w:b w:val="1"/>
+          <w:bCs w:val="1"/>
+          <w:rtl w:val="0"/>
+        </w:rPr>
+        <w:t xml:space="preserve">CSS grid Layout</w:t>
+      </w:r>
+      <w:r>
+        <w:rPr>
+          <w:rtl w:val="0"/>
+        </w:rPr>
+        <w:t xml:space="preserve"> - Origamid (jun/2021)</w:t>
       </w:r>
       <w:r>
         <w:rPr>
@@ -1850,121 +1536,8 @@
       </w:rPr>
     </w:lvl>
   </w:abstractNum>
-  <w:abstractNum w:abstractNumId="2">
-    <w:lvl w:ilvl="0">
-      <w:start w:val="1"/>
-      <w:numFmt w:val="bullet"/>
-      <w:lvlText w:val="●"/>
-      <w:lvlJc w:val="left"/>
-      <w:pPr>
-        <w:ind w:left="720" w:hanging="360"/>
-      </w:pPr>
-      <w:rPr>
-        <w:u w:val="none"/>
-      </w:rPr>
-    </w:lvl>
-    <w:lvl w:ilvl="1">
-      <w:start w:val="1"/>
-      <w:numFmt w:val="bullet"/>
-      <w:lvlText w:val="○"/>
-      <w:lvlJc w:val="left"/>
-      <w:pPr>
-        <w:ind w:left="1440" w:hanging="360"/>
-      </w:pPr>
-      <w:rPr>
-        <w:u w:val="none"/>
-      </w:rPr>
-    </w:lvl>
-    <w:lvl w:ilvl="2">
-      <w:start w:val="1"/>
-      <w:numFmt w:val="bullet"/>
-      <w:lvlText w:val="■"/>
-      <w:lvlJc w:val="left"/>
-      <w:pPr>
-        <w:ind w:left="2160" w:hanging="360"/>
-      </w:pPr>
-      <w:rPr>
-        <w:u w:val="none"/>
-      </w:rPr>
-    </w:lvl>
-    <w:lvl w:ilvl="3">
-      <w:start w:val="1"/>
-      <w:numFmt w:val="bullet"/>
-      <w:lvlText w:val="●"/>
-      <w:lvlJc w:val="left"/>
-      <w:pPr>
-        <w:ind w:left="2880" w:hanging="360"/>
-      </w:pPr>
-      <w:rPr>
-        <w:u w:val="none"/>
-      </w:rPr>
-    </w:lvl>
-    <w:lvl w:ilvl="4">
-      <w:start w:val="1"/>
-      <w:numFmt w:val="bullet"/>
-      <w:lvlText w:val="○"/>
-      <w:lvlJc w:val="left"/>
-      <w:pPr>
-        <w:ind w:left="3600" w:hanging="360"/>
-      </w:pPr>
-      <w:rPr>
-        <w:u w:val="none"/>
-      </w:rPr>
-    </w:lvl>
-    <w:lvl w:ilvl="5">
-      <w:start w:val="1"/>
-      <w:numFmt w:val="bullet"/>
-      <w:lvlText w:val="■"/>
-      <w:lvlJc w:val="left"/>
-      <w:pPr>
-        <w:ind w:left="4320" w:hanging="360"/>
-      </w:pPr>
-      <w:rPr>
-        <w:u w:val="none"/>
-      </w:rPr>
-    </w:lvl>
-    <w:lvl w:ilvl="6">
-      <w:start w:val="1"/>
-      <w:numFmt w:val="bullet"/>
-      <w:lvlText w:val="●"/>
-      <w:lvlJc w:val="left"/>
-      <w:pPr>
-        <w:ind w:left="5040" w:hanging="360"/>
-      </w:pPr>
-      <w:rPr>
-        <w:u w:val="none"/>
-      </w:rPr>
-    </w:lvl>
-    <w:lvl w:ilvl="7">
-      <w:start w:val="1"/>
-      <w:numFmt w:val="bullet"/>
-      <w:lvlText w:val="○"/>
-      <w:lvlJc w:val="left"/>
-      <w:pPr>
-        <w:ind w:left="5760" w:hanging="360"/>
-      </w:pPr>
-      <w:rPr>
-        <w:u w:val="none"/>
-      </w:rPr>
-    </w:lvl>
-    <w:lvl w:ilvl="8">
-      <w:start w:val="1"/>
-      <w:numFmt w:val="bullet"/>
-      <w:lvlText w:val="■"/>
-      <w:lvlJc w:val="left"/>
-      <w:pPr>
-        <w:ind w:left="6480" w:hanging="360"/>
-      </w:pPr>
-      <w:rPr>
-        <w:u w:val="none"/>
-      </w:rPr>
-    </w:lvl>
-  </w:abstractNum>
   <w:num w:numId="1">
     <w:abstractNumId w:val="1"/>
-  </w:num>
-  <w:num w:numId="2">
-    <w:abstractNumId w:val="2"/>
   </w:num>
 </w:numbering>
 </file>
@@ -2007,16 +1580,14 @@
     <w:pPr>
       <w:keepNext w:val="1"/>
       <w:keepLines w:val="1"/>
-      <w:pageBreakBefore w:val="0"/>
-      <w:spacing w:after="200" w:before="480" w:line="240" w:lineRule="auto"/>
+      <w:spacing w:before="120" w:line="240" w:lineRule="auto"/>
     </w:pPr>
     <w:rPr>
-      <w:rFonts w:ascii="Proxima Nova" w:cs="Proxima Nova" w:eastAsia="Proxima Nova" w:hAnsi="Proxima Nova"/>
       <w:b w:val="1"/>
       <w:bCs w:val="1"/>
-      <w:color w:val="00ab44"/>
-      <w:sz w:val="28"/>
-      <w:szCs w:val="28"/>
+      <w:color w:val="c18c5d"/>
+      <w:sz w:val="60"/>
+      <w:szCs w:val="60"/>
     </w:rPr>
   </w:style>
   <w:style w:type="paragraph" w:styleId="Heading2">
@@ -2026,16 +1597,14 @@
     <w:pPr>
       <w:keepNext w:val="1"/>
       <w:keepLines w:val="1"/>
-      <w:pageBreakBefore w:val="0"/>
-      <w:spacing w:before="200" w:line="240" w:lineRule="auto"/>
+      <w:spacing w:after="200" w:before="200" w:line="240" w:lineRule="auto"/>
     </w:pPr>
     <w:rPr>
-      <w:rFonts w:ascii="Proxima Nova" w:cs="Proxima Nova" w:eastAsia="Proxima Nova" w:hAnsi="Proxima Nova"/>
       <w:b w:val="1"/>
       <w:bCs w:val="1"/>
-      <w:color w:val="353744"/>
-      <w:sz w:val="24"/>
-      <w:szCs w:val="24"/>
+      <w:color w:val="c18c5d"/>
+      <w:sz w:val="30"/>
+      <w:szCs w:val="30"/>
     </w:rPr>
   </w:style>
   <w:style w:type="paragraph" w:styleId="Heading3">
@@ -2045,14 +1614,13 @@
     <w:pPr>
       <w:keepNext w:val="1"/>
       <w:keepLines w:val="1"/>
-      <w:pageBreakBefore w:val="0"/>
       <w:spacing w:before="200" w:line="240" w:lineRule="auto"/>
     </w:pPr>
     <w:rPr>
-      <w:rFonts w:ascii="Proxima Nova" w:cs="Proxima Nova" w:eastAsia="Proxima Nova" w:hAnsi="Proxima Nova"/>
       <w:b w:val="1"/>
       <w:bCs w:val="1"/>
-      <w:color w:val="353744"/>
+      <w:sz w:val="24"/>
+      <w:szCs w:val="24"/>
     </w:rPr>
   </w:style>
   <w:style w:type="paragraph" w:styleId="Heading4">
@@ -2062,15 +1630,13 @@
     <w:pPr>
       <w:keepNext w:val="1"/>
       <w:keepLines w:val="1"/>
-      <w:pageBreakBefore w:val="0"/>
-      <w:spacing w:after="0" w:before="160" w:lineRule="auto"/>
+      <w:spacing w:line="240" w:lineRule="auto"/>
+      <w:jc w:val="right"/>
     </w:pPr>
     <w:rPr>
-      <w:rFonts w:ascii="Trebuchet MS" w:cs="Trebuchet MS" w:eastAsia="Trebuchet MS" w:hAnsi="Trebuchet MS"/>
       <w:color w:val="666666"/>
-      <w:sz w:val="22"/>
-      <w:szCs w:val="22"/>
-      <w:u w:val="single"/>
+      <w:sz w:val="20"/>
+      <w:szCs w:val="20"/>
     </w:rPr>
   </w:style>
   <w:style w:type="paragraph" w:styleId="Heading5">
@@ -2231,6 +1797,50 @@
     </w:tblStylePr>
   </w:style>
   <w:style w:type="table" w:styleId="Table3">
+    <w:basedOn w:val="TableNormal"/>
+    <w:tblPr>
+      <w:tblStyleRowBandSize w:val="1"/>
+      <w:tblStyleColBandSize w:val="1"/>
+      <w:tblCellMar/>
+    </w:tblPr>
+    <w:tblStylePr w:type="band1Horz">
+      <w:tcPr/>
+    </w:tblStylePr>
+    <w:tblStylePr w:type="band1Vert">
+      <w:tcPr/>
+    </w:tblStylePr>
+    <w:tblStylePr w:type="band2Horz">
+      <w:tcPr/>
+    </w:tblStylePr>
+    <w:tblStylePr w:type="band2Vert">
+      <w:tcPr/>
+    </w:tblStylePr>
+    <w:tblStylePr w:type="firstCol">
+      <w:tcPr/>
+    </w:tblStylePr>
+    <w:tblStylePr w:type="firstRow">
+      <w:tcPr/>
+    </w:tblStylePr>
+    <w:tblStylePr w:type="lastCol">
+      <w:tcPr/>
+    </w:tblStylePr>
+    <w:tblStylePr w:type="lastRow">
+      <w:tcPr/>
+    </w:tblStylePr>
+    <w:tblStylePr w:type="neCell">
+      <w:tcPr/>
+    </w:tblStylePr>
+    <w:tblStylePr w:type="nwCell">
+      <w:tcPr/>
+    </w:tblStylePr>
+    <w:tblStylePr w:type="seCell">
+      <w:tcPr/>
+    </w:tblStylePr>
+    <w:tblStylePr w:type="swCell">
+      <w:tcPr/>
+    </w:tblStylePr>
+  </w:style>
+  <w:style w:type="table" w:styleId="Table4">
     <w:basedOn w:val="TableNormal"/>
     <w:tblPr>
       <w:tblStyleRowBandSize w:val="1"/>

</xml_diff>